<commit_message>
El kitabi v2.0.7.3: segfault dersi, Beni Hatirla, kismi hacim duzeltmesi
</commit_message>
<xml_diff>
--- a/TrendSurf_Optima_Yonetici_El_Kitabi.docx
+++ b/TrendSurf_Optima_Yonetici_El_Kitabi.docx
@@ -43,7 +43,7 @@
           <w:sz w:val="20"/>
           <w:szCs w:val="20"/>
         </w:rPr>
-        <w:t xml:space="preserve">Sürüm v2.0.7 — 10 Temmuz 2026</w:t>
+        <w:t xml:space="preserve">Sürüm v2.0.7.3 — 10 Temmuz 2026</w:t>
       </w:r>
     </w:p>
     <w:p>
@@ -2636,6 +2636,14 @@
         <w:t xml:space="preserve">Akış: cron-job.org (~15 dk) → GitHub Actions firsat_radari.yml (workflow_dispatch, PAT ile) → firsat_radari.py taraması → Supabase intraday_scores tablosuna UPSERT. GitHub'ın kendi cron'u yalnızca yedek tetikleyicidir (*/20, best-effort). Skor formülü worker.py ile birebir aynıdır (hacim/DD düzeltmesi + CSV'den PB/PE/DY temel bileşeni) — bu sayede uygulamadaki skor ile alarm skoru hiçbir zaman ayrışmaz.</w:t>
       </w:r>
     </w:p>
+    <w:p>
+      <w:pPr>
+        <w:spacing w:after="120"/>
+      </w:pPr>
+      <w:r>
+        <w:t xml:space="preserve">Hacim trendi bileşeni (son 5 gün / son 20 gün ortalaması) YALNIZCA TAMAMLANMIŞ günlerle hesaplanır — bugünün kısmi hacim çubuğu dışlanır (v2.0.7.1). Aksi halde sabah saatlerinde düşük görünen günlük hacim, bileşeni −10'a çekip gün boyu biriktikçe +5'e döndürüyor ve hisse başına 15 puana kadar yapay "sıçrama" alarmı üretiyordu (10 Temmuz sabahı 8 varlık, tamamı bu desende). Fiyat/RSI/momentum canlı kalır; aynı koruma worker.py'de de vardır (formül paritesi).</w:t>
+      </w:r>
+    </w:p>
     <w:tbl>
       <w:tblPr>
         <w:tblW w:type="dxa" w:w="9026"/>
@@ -5800,7 +5808,7 @@
           </w:tcPr>
           <w:p>
             <w:r>
-              <w:t xml:space="preserve">Her push sonrası Streamlit Cloud redeploy tüm oturumları sıfırlar</w:t>
+              <w:t xml:space="preserve">v2.0.7.2 öncesi: redeploy/yenileme oturumu düşürüyordu</w:t>
             </w:r>
           </w:p>
         </w:tc>
@@ -5822,7 +5830,7 @@
           </w:tcPr>
           <w:p>
             <w:r>
-              <w:t xml:space="preserve">Beklenen davranış — push sonrası ilk girişte normal</w:t>
+              <w:t xml:space="preserve">v2.0.7.2'de çözüldü — tso_auth çerezi + st.context.cookies geri yükleme</w:t>
             </w:r>
           </w:p>
         </w:tc>
@@ -6332,6 +6340,77 @@
           <w:p>
             <w:r>
               <w:t xml:space="preserve">Açık madde — kaynak/kod eşlemesi incelenecek; fiyatsız varlık skoru 0</w:t>
+            </w:r>
+          </w:p>
+        </w:tc>
+      </w:tr>
+      <w:tr>
+        <w:trPr>
+          <w:tblHeader w:val="false"/>
+        </w:trPr>
+        <w:tc>
+          <w:tcPr>
+            <w:tcW w:type="dxa" w:w="3008"/>
+            <w:tcBorders>
+              <w:top w:val="single" w:color="BFC9D4" w:sz="1"/>
+              <w:left w:val="single" w:color="BFC9D4" w:sz="1"/>
+              <w:bottom w:val="single" w:color="BFC9D4" w:sz="1"/>
+              <w:right w:val="single" w:color="BFC9D4" w:sz="1"/>
+            </w:tcBorders>
+            <w:tcMar>
+              <w:top w:type="dxa" w:w="80"/>
+              <w:left w:type="dxa" w:w="120"/>
+              <w:bottom w:type="dxa" w:w="80"/>
+              <w:right w:type="dxa" w:w="120"/>
+            </w:tcMar>
+          </w:tcPr>
+          <w:p>
+            <w:r>
+              <w:t xml:space="preserve">Uygulama "Oh no" + Segmentation fault</w:t>
+            </w:r>
+          </w:p>
+        </w:tc>
+        <w:tc>
+          <w:tcPr>
+            <w:tcW w:type="dxa" w:w="3008"/>
+            <w:tcBorders>
+              <w:top w:val="single" w:color="BFC9D4" w:sz="1"/>
+              <w:left w:val="single" w:color="BFC9D4" w:sz="1"/>
+              <w:bottom w:val="single" w:color="BFC9D4" w:sz="1"/>
+              <w:right w:val="single" w:color="BFC9D4" w:sz="1"/>
+            </w:tcBorders>
+            <w:tcMar>
+              <w:top w:type="dxa" w:w="80"/>
+              <w:left w:type="dxa" w:w="120"/>
+              <w:bottom w:type="dxa" w:w="80"/>
+              <w:right w:type="dxa" w:w="120"/>
+            </w:tcMar>
+          </w:tcPr>
+          <w:p>
+            <w:r>
+              <w:t xml:space="preserve">Sürümü sabitlenmemiş bir bağımlılığın bozuk yeni sürümü (örn. 10 Tem 2026: pyarrow 25.0.0, st.dataframe'de segfault)</w:t>
+            </w:r>
+          </w:p>
+        </w:tc>
+        <w:tc>
+          <w:tcPr>
+            <w:tcW w:type="dxa" w:w="3010"/>
+            <w:tcBorders>
+              <w:top w:val="single" w:color="BFC9D4" w:sz="1"/>
+              <w:left w:val="single" w:color="BFC9D4" w:sz="1"/>
+              <w:bottom w:val="single" w:color="BFC9D4" w:sz="1"/>
+              <w:right w:val="single" w:color="BFC9D4" w:sz="1"/>
+            </w:tcBorders>
+            <w:tcMar>
+              <w:top w:type="dxa" w:w="80"/>
+              <w:left w:type="dxa" w:w="120"/>
+              <w:bottom w:type="dxa" w:w="80"/>
+              <w:right w:type="dxa" w:w="120"/>
+            </w:tcMar>
+          </w:tcPr>
+          <w:p>
+            <w:r>
+              <w:t xml:space="preserve">Stabil ve çöken deploy loglarının paket listelerini karşılaştır; değişen paketi requirements.txt'te eski sürüme sabitle. Kod revert'i işe yaramıyorsa suçlu bağımlılıktır</w:t>
             </w:r>
           </w:p>
         </w:tc>
@@ -6430,7 +6509,46 @@
           <w:b/>
           <w:bCs/>
         </w:rPr>
-        <w:t xml:space="preserve">v2.0.5.x – v2.0.7 (Temmuz 2026) — Fırsat Radarı ve Kalıcılık Dönemi</w:t>
+        <w:t xml:space="preserve">v2.0.5.x – v2.0.7.x (Temmuz 2026) — Fırsat Radarı ve Kalıcılık Dönemi</w:t>
+      </w:r>
+    </w:p>
+    <w:p>
+      <w:pPr>
+        <w:pStyle w:val="ListParagraph"/>
+        <w:numPr>
+          <w:ilvl w:val="0"/>
+          <w:numId w:val="14"/>
+        </w:numPr>
+        <w:spacing w:after="80"/>
+      </w:pPr>
+      <w:r>
+        <w:t xml:space="preserve">v2.0.7.3: pyarrow==24.0.0 ve websockets==16.0 sabitlendi — 10 Temmuz'da yayınlanan pyarrow 25.0.0, st.dataframe serileştirmesinde Segmentation fault üreterek uygulamayı her etkileşimde çökertti (giriş ekranı tablosuz olduğu için açılıyordu). Teşhis, stabil ve çöken deploy loglarının paket karşılaştırmasıyla kondu; kod değişikliklerinin suçu yoktu</w:t>
+      </w:r>
+    </w:p>
+    <w:p>
+      <w:pPr>
+        <w:pStyle w:val="ListParagraph"/>
+        <w:numPr>
+          <w:ilvl w:val="0"/>
+          <w:numId w:val="14"/>
+        </w:numPr>
+        <w:spacing w:after="80"/>
+      </w:pPr>
+      <w:r>
+        <w:t xml:space="preserve">v2.0.7.2: Beni Hatırla kalıcı oturum — 90 günlük token tso_auth çerezine yazılır, açılışta st.context.cookies ile sunucu tarafında geri okunur (iframe sandbox'a takılan localStorage denemelerinin yerine). Sayfa yenileme ve push sonrası redeploy artık oturumu düşürmez; çıkışta çerez temizlenir</w:t>
+      </w:r>
+    </w:p>
+    <w:p>
+      <w:pPr>
+        <w:pStyle w:val="ListParagraph"/>
+        <w:numPr>
+          <w:ilvl w:val="0"/>
+          <w:numId w:val="14"/>
+        </w:numPr>
+        <w:spacing w:after="80"/>
+      </w:pPr>
+      <w:r>
+        <w:t xml:space="preserve">v2.0.7.1: Skorun hacim trendi bileşeninde bugünün kısmi çubuğu dışlandı — sabah/gün içi yapay sıçrama alarmları giderildi (bkz. 3.1)</w:t>
       </w:r>
     </w:p>
     <w:p>
@@ -6845,7 +6963,7 @@
         <w:sz w:val="18"/>
         <w:szCs w:val="18"/>
       </w:rPr>
-      <w:t xml:space="preserve">TrendSurf Optima v2.0.7 — Sayfa </w:t>
+      <w:t xml:space="preserve">TrendSurf Optima v2.0.7.3 — Sayfa </w:t>
     </w:r>
     <w:r>
       <w:rPr>

</xml_diff>